<commit_message>
docs(manuales): R1 tables overview with rendered ER diagrams; Mermaid renderer; T4 says production has only Libro N° 1
Co-Authored-By: Claude Fable 5.1 <noreply@anthropic.com>
</commit_message>
<xml_diff>
--- a/docs/manuales/word/SIGeV-T4-Modelo-de-datos.docx
+++ b/docs/manuales/word/SIGeV-T4-Modelo-de-datos.docx
@@ -1419,7 +1419,7 @@
     </w:tbl>
     <w:p>
       <w:pPr>
-        <w:spacing w:after="120"/>
+        <w:spacing w:after="0" w:before="0"/>
       </w:pPr>
     </w:p>
     <w:p>
@@ -2144,7 +2144,7 @@
     </w:tbl>
     <w:p>
       <w:pPr>
-        <w:spacing w:after="120"/>
+        <w:spacing w:after="0" w:before="0"/>
       </w:pPr>
     </w:p>
     <w:p>
@@ -2292,9 +2292,9 @@
       </w:tblPr>
       <w:tblGrid>
         <w:gridCol w:w="907"/>
-        <w:gridCol w:w="3530"/>
-        <w:gridCol w:w="3294"/>
-        <w:gridCol w:w="1341"/>
+        <w:gridCol w:w="2849"/>
+        <w:gridCol w:w="2658"/>
+        <w:gridCol w:w="2658"/>
       </w:tblGrid>
       <w:tr>
         <w:trPr>
@@ -2326,7 +2326,7 @@
         </w:tc>
         <w:tc>
           <w:tcPr>
-            <w:tcW w:type="dxa" w:w="3530"/>
+            <w:tcW w:type="dxa" w:w="2849"/>
             <w:shd w:fill="DCEBF7" w:color="auto" w:val="clear"/>
             <w:tcMar>
               <w:top w:type="dxa" w:w="60"/>
@@ -2350,7 +2350,7 @@
         </w:tc>
         <w:tc>
           <w:tcPr>
-            <w:tcW w:type="dxa" w:w="3294"/>
+            <w:tcW w:type="dxa" w:w="2658"/>
             <w:shd w:fill="DCEBF7" w:color="auto" w:val="clear"/>
             <w:tcMar>
               <w:top w:type="dxa" w:w="60"/>
@@ -2374,7 +2374,7 @@
         </w:tc>
         <w:tc>
           <w:tcPr>
-            <w:tcW w:type="dxa" w:w="1341"/>
+            <w:tcW w:type="dxa" w:w="2658"/>
             <w:shd w:fill="DCEBF7" w:color="auto" w:val="clear"/>
             <w:tcMar>
               <w:top w:type="dxa" w:w="60"/>
@@ -2437,7 +2437,7 @@
         </w:tc>
         <w:tc>
           <w:tcPr>
-            <w:tcW w:type="dxa" w:w="3530"/>
+            <w:tcW w:type="dxa" w:w="2849"/>
             <w:tcMar>
               <w:top w:type="dxa" w:w="60"/>
               <w:left w:type="dxa" w:w="100"/>
@@ -2573,7 +2573,7 @@
         </w:tc>
         <w:tc>
           <w:tcPr>
-            <w:tcW w:type="dxa" w:w="3294"/>
+            <w:tcW w:type="dxa" w:w="2658"/>
             <w:tcMar>
               <w:top w:type="dxa" w:w="60"/>
               <w:left w:type="dxa" w:w="100"/>
@@ -2685,7 +2685,7 @@
         </w:tc>
         <w:tc>
           <w:tcPr>
-            <w:tcW w:type="dxa" w:w="1341"/>
+            <w:tcW w:type="dxa" w:w="2658"/>
             <w:tcMar>
               <w:top w:type="dxa" w:w="60"/>
               <w:left w:type="dxa" w:w="100"/>
@@ -2743,7 +2743,7 @@
         </w:tc>
         <w:tc>
           <w:tcPr>
-            <w:tcW w:type="dxa" w:w="3530"/>
+            <w:tcW w:type="dxa" w:w="2849"/>
             <w:tcMar>
               <w:top w:type="dxa" w:w="60"/>
               <w:left w:type="dxa" w:w="100"/>
@@ -2804,7 +2804,7 @@
         </w:tc>
         <w:tc>
           <w:tcPr>
-            <w:tcW w:type="dxa" w:w="3294"/>
+            <w:tcW w:type="dxa" w:w="2658"/>
             <w:tcMar>
               <w:top w:type="dxa" w:w="60"/>
               <w:left w:type="dxa" w:w="100"/>
@@ -2832,20 +2832,30 @@
         </w:tc>
         <w:tc>
           <w:tcPr>
-            <w:tcW w:type="dxa" w:w="1341"/>
-            <w:tcMar>
-              <w:top w:type="dxa" w:w="60"/>
-              <w:left w:type="dxa" w:w="100"/>
-              <w:bottom w:type="dxa" w:w="60"/>
-              <w:right w:type="dxa" w:w="100"/>
-            </w:tcMar>
-          </w:tcPr>
-          <w:p>
-            <w:pPr>
-              <w:spacing w:after="0"/>
-            </w:pPr>
-            <w:r>
-              <w:t xml:space="preserve">El libro de socios. Hoy: Libro 1 cerrado, Libro 2 abierto</w:t>
+            <w:tcW w:type="dxa" w:w="2658"/>
+            <w:tcMar>
+              <w:top w:type="dxa" w:w="60"/>
+              <w:left w:type="dxa" w:w="100"/>
+              <w:bottom w:type="dxa" w:w="60"/>
+              <w:right w:type="dxa" w:w="100"/>
+            </w:tcMar>
+          </w:tcPr>
+          <w:p>
+            <w:pPr>
+              <w:spacing w:after="0"/>
+            </w:pPr>
+            <w:r>
+              <w:t xml:space="preserve">El libro de socios. En producción hay uno solo, el </w:t>
+            </w:r>
+            <w:r>
+              <w:rPr>
+                <w:b/>
+                <w:bCs/>
+              </w:rPr>
+              <w:t xml:space="preserve">Libro N° 1</w:t>
+            </w:r>
+            <w:r>
+              <w:t xml:space="preserve">, abierto; el Libro 2 existió únicamente en el simulacro local del Módulo 6</w:t>
             </w:r>
           </w:p>
         </w:tc>
@@ -2890,7 +2900,7 @@
         </w:tc>
         <w:tc>
           <w:tcPr>
-            <w:tcW w:type="dxa" w:w="3530"/>
+            <w:tcW w:type="dxa" w:w="2849"/>
             <w:tcMar>
               <w:top w:type="dxa" w:w="60"/>
               <w:left w:type="dxa" w:w="100"/>
@@ -2939,7 +2949,7 @@
         </w:tc>
         <w:tc>
           <w:tcPr>
-            <w:tcW w:type="dxa" w:w="3294"/>
+            <w:tcW w:type="dxa" w:w="2658"/>
             <w:tcMar>
               <w:top w:type="dxa" w:w="60"/>
               <w:left w:type="dxa" w:w="100"/>
@@ -2979,7 +2989,7 @@
         </w:tc>
         <w:tc>
           <w:tcPr>
-            <w:tcW w:type="dxa" w:w="1341"/>
+            <w:tcW w:type="dxa" w:w="2658"/>
             <w:tcMar>
               <w:top w:type="dxa" w:w="60"/>
               <w:left w:type="dxa" w:w="100"/>
@@ -3044,7 +3054,7 @@
         </w:tc>
         <w:tc>
           <w:tcPr>
-            <w:tcW w:type="dxa" w:w="3530"/>
+            <w:tcW w:type="dxa" w:w="2849"/>
             <w:tcMar>
               <w:top w:type="dxa" w:w="60"/>
               <w:left w:type="dxa" w:w="100"/>
@@ -3105,7 +3115,7 @@
         </w:tc>
         <w:tc>
           <w:tcPr>
-            <w:tcW w:type="dxa" w:w="3294"/>
+            <w:tcW w:type="dxa" w:w="2658"/>
             <w:tcMar>
               <w:top w:type="dxa" w:w="60"/>
               <w:left w:type="dxa" w:w="100"/>
@@ -3124,7 +3134,7 @@
         </w:tc>
         <w:tc>
           <w:tcPr>
-            <w:tcW w:type="dxa" w:w="1341"/>
+            <w:tcW w:type="dxa" w:w="2658"/>
             <w:tcMar>
               <w:top w:type="dxa" w:w="60"/>
               <w:left w:type="dxa" w:w="100"/>
@@ -3182,7 +3192,7 @@
         </w:tc>
         <w:tc>
           <w:tcPr>
-            <w:tcW w:type="dxa" w:w="3530"/>
+            <w:tcW w:type="dxa" w:w="2849"/>
             <w:tcMar>
               <w:top w:type="dxa" w:w="60"/>
               <w:left w:type="dxa" w:w="100"/>
@@ -3267,7 +3277,7 @@
         </w:tc>
         <w:tc>
           <w:tcPr>
-            <w:tcW w:type="dxa" w:w="3294"/>
+            <w:tcW w:type="dxa" w:w="2658"/>
             <w:tcMar>
               <w:top w:type="dxa" w:w="60"/>
               <w:left w:type="dxa" w:w="100"/>
@@ -3319,7 +3329,7 @@
         </w:tc>
         <w:tc>
           <w:tcPr>
-            <w:tcW w:type="dxa" w:w="1341"/>
+            <w:tcW w:type="dxa" w:w="2658"/>
             <w:tcMar>
               <w:top w:type="dxa" w:w="60"/>
               <w:left w:type="dxa" w:w="100"/>
@@ -3377,7 +3387,7 @@
         </w:tc>
         <w:tc>
           <w:tcPr>
-            <w:tcW w:type="dxa" w:w="3530"/>
+            <w:tcW w:type="dxa" w:w="2849"/>
             <w:tcMar>
               <w:top w:type="dxa" w:w="60"/>
               <w:left w:type="dxa" w:w="100"/>
@@ -3450,7 +3460,7 @@
         </w:tc>
         <w:tc>
           <w:tcPr>
-            <w:tcW w:type="dxa" w:w="3294"/>
+            <w:tcW w:type="dxa" w:w="2658"/>
             <w:tcMar>
               <w:top w:type="dxa" w:w="60"/>
               <w:left w:type="dxa" w:w="100"/>
@@ -3514,7 +3524,7 @@
         </w:tc>
         <w:tc>
           <w:tcPr>
-            <w:tcW w:type="dxa" w:w="1341"/>
+            <w:tcW w:type="dxa" w:w="2658"/>
             <w:tcMar>
               <w:top w:type="dxa" w:w="60"/>
               <w:left w:type="dxa" w:w="100"/>
@@ -3535,7 +3545,7 @@
     </w:tbl>
     <w:p>
       <w:pPr>
-        <w:spacing w:after="120"/>
+        <w:spacing w:after="0" w:before="0"/>
       </w:pPr>
     </w:p>
     <w:p>
@@ -4451,7 +4461,7 @@
     </w:tbl>
     <w:p>
       <w:pPr>
-        <w:spacing w:after="120"/>
+        <w:spacing w:after="0" w:before="0"/>
       </w:pPr>
     </w:p>
     <w:p>
@@ -6216,7 +6226,7 @@
     </w:tbl>
     <w:p>
       <w:pPr>
-        <w:spacing w:after="120"/>
+        <w:spacing w:after="0" w:before="0"/>
       </w:pPr>
     </w:p>
     <w:p>
@@ -7064,7 +7074,7 @@
     </w:tbl>
     <w:p>
       <w:pPr>
-        <w:spacing w:after="120"/>
+        <w:spacing w:after="0" w:before="0"/>
       </w:pPr>
     </w:p>
     <w:p>
@@ -8100,7 +8110,7 @@
     </w:tbl>
     <w:p>
       <w:pPr>
-        <w:spacing w:after="120"/>
+        <w:spacing w:after="0" w:before="0"/>
       </w:pPr>
     </w:p>
     <w:p>
@@ -9060,7 +9070,7 @@
     </w:tbl>
     <w:p>
       <w:pPr>
-        <w:spacing w:after="120"/>
+        <w:spacing w:after="0" w:before="0"/>
       </w:pPr>
     </w:p>
     <w:p>
@@ -9928,7 +9938,7 @@
     </w:tbl>
     <w:p>
       <w:pPr>
-        <w:spacing w:after="120"/>
+        <w:spacing w:after="0" w:before="0"/>
       </w:pPr>
     </w:p>
     <w:p>
@@ -11381,7 +11391,7 @@
     </w:tbl>
     <w:p>
       <w:pPr>
-        <w:spacing w:after="120"/>
+        <w:spacing w:after="0" w:before="0"/>
       </w:pPr>
     </w:p>
     <w:p>
@@ -16385,7 +16395,7 @@
     </w:tbl>
     <w:p>
       <w:pPr>
-        <w:spacing w:after="120"/>
+        <w:spacing w:after="0" w:before="0"/>
       </w:pPr>
     </w:p>
     <w:p>
@@ -18066,7 +18076,7 @@
     </w:tbl>
     <w:p>
       <w:pPr>
-        <w:spacing w:after="120"/>
+        <w:spacing w:after="0" w:before="0"/>
       </w:pPr>
     </w:p>
     <w:p>
@@ -18422,7 +18432,7 @@
           <w:ilvl w:val="0"/>
           <w:numId w:val="2"/>
         </w:numPr>
-        <w:spacing w:after="60"/>
+        <w:spacing w:after="240"/>
       </w:pPr>
       <w:r>
         <w:rPr>
@@ -18465,11 +18475,6 @@
         <w:t xml:space="preserve"> no tiene clave
 foránea porque es polimórfico; la integridad la cuida la capa de servicio.</w:t>
       </w:r>
-    </w:p>
-    <w:p>
-      <w:pPr>
-        <w:spacing w:after="60"/>
-      </w:pPr>
     </w:p>
     <w:p>
       <w:pPr>
@@ -22199,7 +22204,7 @@
     </w:tbl>
     <w:p>
       <w:pPr>
-        <w:spacing w:after="120"/>
+        <w:spacing w:after="0" w:before="0"/>
       </w:pPr>
     </w:p>
     <w:p>
@@ -23036,7 +23041,7 @@
     </w:tbl>
     <w:p>
       <w:pPr>
-        <w:spacing w:after="120"/>
+        <w:spacing w:after="0" w:before="0"/>
       </w:pPr>
     </w:p>
     <w:p>

</xml_diff>